<commit_message>
Orienta a proposta à funcionalidade: remove a história do documento
A história de usuário sai do corpo do documento — permanece no backlog
como origem da criação ou evolução da funcionalidade e é citada apenas
na coluna Origem do histórico de versões. Anatomia passa a 10 seções,
com a descrição assumindo o papel de âncora da funcionalidade.

Co-Authored-By: Claude Fable 5 <noreply@anthropic.com>
Claude-Session: https://claude.ai/code/session_017GrziW5UYuREHfRcnVVMio
</commit_message>
<xml_diff>
--- a/especificacoes/proposta-estrutura-n3-negocial.docx
+++ b/especificacoes/proposta-estrutura-n3-negocial.docx
@@ -218,7 +218,7 @@
                 <w:rFonts w:ascii="Calibri" w:hAnsi="Calibri"/>
                 <w:sz w:val="18"/>
               </w:rPr>
-              <w:t>Nome da funcionalidade, prioridade e uma ou duas frases de negócio dizendo o que ela entrega</w:t>
+              <w:t>Nome da funcionalidade, prioridade e uma ou duas frases de negócio dizendo quem faz o quê e o que a funcionalidade entrega</w:t>
             </w:r>
           </w:p>
         </w:tc>
@@ -272,7 +272,7 @@
                 <w:b/>
                 <w:sz w:val="18"/>
               </w:rPr>
-              <w:t>História de usuário</w:t>
+              <w:t>Superfície</w:t>
             </w:r>
           </w:p>
         </w:tc>
@@ -289,7 +289,7 @@
                 <w:rFonts w:ascii="Calibri" w:hAnsi="Calibri"/>
                 <w:sz w:val="18"/>
               </w:rPr>
-              <w:t>O card no formato ator + ação + benefício, que sustenta a conversa e a priorização</w:t>
+              <w:t>Onde a funcionalidade vive: tela própria (com o caminho de menu) ou ação dentro de outra tela</w:t>
             </w:r>
           </w:p>
         </w:tc>
@@ -306,7 +306,7 @@
                 <w:rFonts w:ascii="Calibri" w:hAnsi="Calibri"/>
                 <w:sz w:val="18"/>
               </w:rPr>
-              <w:t>Detalhe de campo, regra, mensagem ou tela</w:t>
+              <w:t>Descrição de layout</w:t>
             </w:r>
           </w:p>
         </w:tc>
@@ -343,7 +343,7 @@
                 <w:b/>
                 <w:sz w:val="18"/>
               </w:rPr>
-              <w:t>Superfície</w:t>
+              <w:t>Permissões</w:t>
             </w:r>
           </w:p>
         </w:tc>
@@ -360,7 +360,7 @@
                 <w:rFonts w:ascii="Calibri" w:hAnsi="Calibri"/>
                 <w:sz w:val="18"/>
               </w:rPr>
-              <w:t>Onde a funcionalidade vive: tela própria (com o caminho de menu) ou ação dentro de outra tela</w:t>
+              <w:t>Perfil × o que ele faz nesta funcionalidade, incluindo os perfis que não atuam</w:t>
             </w:r>
           </w:p>
         </w:tc>
@@ -377,7 +377,7 @@
                 <w:rFonts w:ascii="Calibri" w:hAnsi="Calibri"/>
                 <w:sz w:val="18"/>
               </w:rPr>
-              <w:t>Descrição de layout</w:t>
+              <w:t>Perfis genéricos ("usuário")</w:t>
             </w:r>
           </w:p>
         </w:tc>
@@ -414,7 +414,7 @@
                 <w:b/>
                 <w:sz w:val="18"/>
               </w:rPr>
-              <w:t>Permissões</w:t>
+              <w:t>Regras de negócio</w:t>
             </w:r>
           </w:p>
         </w:tc>
@@ -431,7 +431,7 @@
                 <w:rFonts w:ascii="Calibri" w:hAnsi="Calibri"/>
                 <w:sz w:val="18"/>
               </w:rPr>
-              <w:t>Perfil × o que ele faz nesta funcionalidade, incluindo os perfis que não atuam</w:t>
+              <w:t>Invariantes atômicas, numeradas dentro da funcionalidade (RN-1, RN-2…): uma exigência por regra</w:t>
             </w:r>
           </w:p>
         </w:tc>
@@ -448,7 +448,7 @@
                 <w:rFonts w:ascii="Calibri" w:hAnsi="Calibri"/>
                 <w:sz w:val="18"/>
               </w:rPr>
-              <w:t>Perfis genéricos ("usuário")</w:t>
+              <w:t>A reação do sistema ("bloqueia", "exibe mensagem") e o texto da mensagem</w:t>
             </w:r>
           </w:p>
         </w:tc>
@@ -485,7 +485,7 @@
                 <w:b/>
                 <w:sz w:val="18"/>
               </w:rPr>
-              <w:t>Regras de negócio</w:t>
+              <w:t>Cenários</w:t>
             </w:r>
           </w:p>
         </w:tc>
@@ -502,7 +502,7 @@
                 <w:rFonts w:ascii="Calibri" w:hAnsi="Calibri"/>
                 <w:sz w:val="18"/>
               </w:rPr>
-              <w:t>Invariantes atômicas, numeradas dentro da funcionalidade (RN-1, RN-2…): uma exigência por regra</w:t>
+              <w:t>Dado/Quando/Então, um bloco por cenário, organizados em cinco grupos: caminho feliz, erros de validação, conflitos com dados existentes, restrições de acesso e estados especiais. É aqui que a reação do sistema aparece</w:t>
             </w:r>
           </w:p>
         </w:tc>
@@ -519,7 +519,7 @@
                 <w:rFonts w:ascii="Calibri" w:hAnsi="Calibri"/>
                 <w:sz w:val="18"/>
               </w:rPr>
-              <w:t>A reação do sistema ("bloqueia", "exibe mensagem") e o texto da mensagem</w:t>
+              <w:t>Texto literal das mensagens (referenciado, não copiado)</w:t>
             </w:r>
           </w:p>
         </w:tc>
@@ -556,7 +556,7 @@
                 <w:b/>
                 <w:sz w:val="18"/>
               </w:rPr>
-              <w:t>Cenários</w:t>
+              <w:t>Campos</w:t>
             </w:r>
           </w:p>
         </w:tc>
@@ -573,7 +573,7 @@
                 <w:rFonts w:ascii="Calibri" w:hAnsi="Calibri"/>
                 <w:sz w:val="18"/>
               </w:rPr>
-              <w:t>Dado/Quando/Então, um bloco por cenário, organizados em cinco grupos: caminho feliz, erros de validação, conflitos com dados existentes, restrições de acesso e estados especiais. É aqui que a reação do sistema aparece</w:t>
+              <w:t>Tabela: label, tipo, obrigatoriedade, forma de input, edição e validação</w:t>
             </w:r>
           </w:p>
         </w:tc>
@@ -590,7 +590,7 @@
                 <w:rFonts w:ascii="Calibri" w:hAnsi="Calibri"/>
                 <w:sz w:val="18"/>
               </w:rPr>
-              <w:t>Texto literal das mensagens (referenciado, não copiado)</w:t>
+              <w:t>Definições físicas de banco</w:t>
             </w:r>
           </w:p>
         </w:tc>
@@ -627,7 +627,7 @@
                 <w:b/>
                 <w:sz w:val="18"/>
               </w:rPr>
-              <w:t>Campos</w:t>
+              <w:t>Campos automáticos</w:t>
             </w:r>
           </w:p>
         </w:tc>
@@ -644,7 +644,7 @@
                 <w:rFonts w:ascii="Calibri" w:hAnsi="Calibri"/>
                 <w:sz w:val="18"/>
               </w:rPr>
-              <w:t>Tabela: label, tipo, obrigatoriedade, forma de input, edição e validação</w:t>
+              <w:t>Tabela: campo, valor e quando é preenchido pelo sistema</w:t>
             </w:r>
           </w:p>
         </w:tc>
@@ -661,7 +661,7 @@
                 <w:rFonts w:ascii="Calibri" w:hAnsi="Calibri"/>
                 <w:sz w:val="18"/>
               </w:rPr>
-              <w:t>Definições físicas de banco</w:t>
+              <w:t>—</w:t>
             </w:r>
           </w:p>
         </w:tc>
@@ -698,7 +698,7 @@
                 <w:b/>
                 <w:sz w:val="18"/>
               </w:rPr>
-              <w:t>Campos automáticos</w:t>
+              <w:t>Mensagens</w:t>
             </w:r>
           </w:p>
         </w:tc>
@@ -715,7 +715,7 @@
                 <w:rFonts w:ascii="Calibri" w:hAnsi="Calibri"/>
                 <w:sz w:val="18"/>
               </w:rPr>
-              <w:t>Tabela: campo, valor e quando é preenchido pelo sistema</w:t>
+              <w:t>Tabela condição → texto exibido, com críticas e sucesso</w:t>
             </w:r>
           </w:p>
         </w:tc>
@@ -732,7 +732,7 @@
                 <w:rFonts w:ascii="Calibri" w:hAnsi="Calibri"/>
                 <w:sz w:val="18"/>
               </w:rPr>
-              <w:t>—</w:t>
+              <w:t>Mensagens dentro dos cenários ou das regras</w:t>
             </w:r>
           </w:p>
         </w:tc>
@@ -769,7 +769,7 @@
                 <w:b/>
                 <w:sz w:val="18"/>
               </w:rPr>
-              <w:t>Mensagens</w:t>
+              <w:t>Comportamento e estados da tela</w:t>
             </w:r>
           </w:p>
         </w:tc>
@@ -786,7 +786,7 @@
                 <w:rFonts w:ascii="Calibri" w:hAnsi="Calibri"/>
                 <w:sz w:val="18"/>
               </w:rPr>
-              <w:t>Tabela condição → texto exibido, com críticas e sucesso</w:t>
+              <w:t>Navegação, ações padrão (Cancelar, Voltar, Limpar, Fechar) e os estados: carregando, vazio, erro, sucesso e limites</w:t>
             </w:r>
           </w:p>
         </w:tc>
@@ -803,7 +803,7 @@
                 <w:rFonts w:ascii="Calibri" w:hAnsi="Calibri"/>
                 <w:sz w:val="18"/>
               </w:rPr>
-              <w:t>Mensagens dentro dos cenários ou das regras</w:t>
+              <w:t>Regra de negócio disfarçada de comportamento</w:t>
             </w:r>
           </w:p>
         </w:tc>
@@ -823,77 +823,6 @@
                 <w:sz w:val="18"/>
               </w:rPr>
               <w:t>10</w:t>
-            </w:r>
-          </w:p>
-        </w:tc>
-        <w:tc>
-          <w:tcPr>
-            <w:tcW w:type="dxa" w:w="2409"/>
-          </w:tcPr>
-          <w:p>
-            <w:pPr>
-              <w:spacing w:after="40"/>
-            </w:pPr>
-            <w:r>
-              <w:rPr>
-                <w:rFonts w:ascii="Calibri" w:hAnsi="Calibri"/>
-                <w:b/>
-                <w:sz w:val="18"/>
-              </w:rPr>
-              <w:t>Comportamento e estados da tela</w:t>
-            </w:r>
-          </w:p>
-        </w:tc>
-        <w:tc>
-          <w:tcPr>
-            <w:tcW w:type="dxa" w:w="2409"/>
-          </w:tcPr>
-          <w:p>
-            <w:pPr>
-              <w:spacing w:after="40"/>
-            </w:pPr>
-            <w:r>
-              <w:rPr>
-                <w:rFonts w:ascii="Calibri" w:hAnsi="Calibri"/>
-                <w:sz w:val="18"/>
-              </w:rPr>
-              <w:t>Navegação, ações padrão (Cancelar, Voltar, Limpar, Fechar) e os estados: carregando, vazio, erro, sucesso e limites</w:t>
-            </w:r>
-          </w:p>
-        </w:tc>
-        <w:tc>
-          <w:tcPr>
-            <w:tcW w:type="dxa" w:w="2409"/>
-          </w:tcPr>
-          <w:p>
-            <w:pPr>
-              <w:spacing w:after="40"/>
-            </w:pPr>
-            <w:r>
-              <w:rPr>
-                <w:rFonts w:ascii="Calibri" w:hAnsi="Calibri"/>
-                <w:sz w:val="18"/>
-              </w:rPr>
-              <w:t>Regra de negócio disfarçada de comportamento</w:t>
-            </w:r>
-          </w:p>
-        </w:tc>
-      </w:tr>
-      <w:tr>
-        <w:tc>
-          <w:tcPr>
-            <w:tcW w:type="dxa" w:w="2409"/>
-          </w:tcPr>
-          <w:p>
-            <w:pPr>
-              <w:spacing w:after="40"/>
-            </w:pPr>
-            <w:r>
-              <w:rPr>
-                <w:rFonts w:ascii="Calibri" w:hAnsi="Calibri"/>
-                <w:sz w:val="18"/>
-              </w:rPr>
-              <w:t>11</w:t>
             </w:r>
           </w:p>
         </w:tc>
@@ -994,6 +923,30 @@
     </w:p>
     <w:p>
       <w:pPr>
+        <w:spacing w:before="0" w:after="100" w:line="276" w:lineRule="auto"/>
+        <w:jc w:val="both"/>
+      </w:pPr>
+      <w:r>
+        <w:rPr>
+          <w:b/>
+        </w:rPr>
+        <w:t>O documento é orientado à funcionalidade — a história de usuário não entra nele.</w:t>
+      </w:r>
+      <w:r>
+        <w:t xml:space="preserve"> A história é o que origina a criação ou a evolução de uma funcionalidade: ela vive no backlog, dá o lastro à demanda e é citada apenas como </w:t>
+      </w:r>
+      <w:r>
+        <w:rPr>
+          <w:b/>
+        </w:rPr>
+        <w:t>origem da versão</w:t>
+      </w:r>
+      <w:r>
+        <w:t xml:space="preserve"> no histórico do documento. Quem descreve o que a funcionalidade é, aqui, é a sua descrição; quem prova o comportamento são as regras e os cenários.</w:t>
+      </w:r>
+    </w:p>
+    <w:p>
+      <w:pPr>
         <w:pStyle w:val="Heading2"/>
         <w:spacing w:before="260" w:after="80" w:line="276" w:lineRule="auto"/>
         <w:jc w:val="left"/>
@@ -1300,7 +1253,7 @@
                 <w:rFonts w:ascii="Calibri" w:hAnsi="Calibri"/>
                 <w:sz w:val="18"/>
               </w:rPr>
-              <w:t>Era o documento</w:t>
+              <w:t>Organizava o documento — o documento era uma lista de histórias</w:t>
             </w:r>
           </w:p>
         </w:tc>
@@ -1317,7 +1270,7 @@
                 <w:rFonts w:ascii="Calibri" w:hAnsi="Calibri"/>
                 <w:sz w:val="18"/>
               </w:rPr>
-              <w:t>Continua presente, como âncora da conversa e da priorização — enxuta</w:t>
+              <w:t>Sai do documento: permanece no backlog como origem da criação ou da evolução, citada no histórico de versões. O documento passa a ser organizado por funcionalidade</w:t>
             </w:r>
           </w:p>
         </w:tc>
@@ -2035,49 +1988,6 @@
       </w:pPr>
       <w:r>
         <w:t>Permite ao comprador registrar a precificação de uma solicitação de compra — classificação do processo, título, vigência, valores unitários e especificações dos itens e anexos das propostas — e encaminhar o processo à etapa seguinte com as informações necessárias ao Despacho do Presidente.</w:t>
-      </w:r>
-    </w:p>
-    <w:p>
-      <w:pPr>
-        <w:pStyle w:val="Heading3"/>
-        <w:spacing w:before="220" w:after="80" w:line="276" w:lineRule="auto"/>
-        <w:jc w:val="left"/>
-      </w:pPr>
-      <w:r>
-        <w:t>História de usuário</w:t>
-      </w:r>
-    </w:p>
-    <w:p>
-      <w:pPr>
-        <w:spacing w:before="0" w:after="100" w:line="276" w:lineRule="auto"/>
-        <w:jc w:val="both"/>
-      </w:pPr>
-      <w:r>
-        <w:rPr>
-          <w:b/>
-        </w:rPr>
-        <w:t>Como</w:t>
-      </w:r>
-      <w:r>
-        <w:t xml:space="preserve"> comprador, </w:t>
-      </w:r>
-      <w:r>
-        <w:rPr>
-          <w:b/>
-        </w:rPr>
-        <w:t>quero</w:t>
-      </w:r>
-      <w:r>
-        <w:t xml:space="preserve"> registrar a precificação de uma solicitação de compra e encaminhá-la, </w:t>
-      </w:r>
-      <w:r>
-        <w:rPr>
-          <w:b/>
-        </w:rPr>
-        <w:t>para</w:t>
-      </w:r>
-      <w:r>
-        <w:t xml:space="preserve"> que o processo siga à etapa seguinte com os valores e as informações que fundamentam a decisão.</w:t>
       </w:r>
     </w:p>
     <w:p>
@@ -6108,50 +6018,7 @@
         <w:jc w:val="both"/>
       </w:pPr>
       <w:r>
-        <w:t>Permite ao Gerente de Suprimentos localizar as solicitações de compra encaminhadas para revisão, distinguindo as pendentes das já revisadas, e abrir a que deseja analisar.</w:t>
-      </w:r>
-    </w:p>
-    <w:p>
-      <w:pPr>
-        <w:pStyle w:val="Heading3"/>
-        <w:spacing w:before="220" w:after="80" w:line="276" w:lineRule="auto"/>
-        <w:jc w:val="left"/>
-      </w:pPr>
-      <w:r>
-        <w:t>História de usuário</w:t>
-      </w:r>
-    </w:p>
-    <w:p>
-      <w:pPr>
-        <w:spacing w:before="0" w:after="100" w:line="276" w:lineRule="auto"/>
-        <w:jc w:val="both"/>
-      </w:pPr>
-      <w:r>
-        <w:rPr>
-          <w:b/>
-        </w:rPr>
-        <w:t>Como</w:t>
-      </w:r>
-      <w:r>
-        <w:t xml:space="preserve"> gerente de suprimentos, </w:t>
-      </w:r>
-      <w:r>
-        <w:rPr>
-          <w:b/>
-        </w:rPr>
-        <w:t>quero</w:t>
-      </w:r>
-      <w:r>
-        <w:t xml:space="preserve"> pesquisar as solicitações de compra encaminhadas para revisão, </w:t>
-      </w:r>
-      <w:r>
-        <w:rPr>
-          <w:b/>
-        </w:rPr>
-        <w:t>para</w:t>
-      </w:r>
-      <w:r>
-        <w:t xml:space="preserve"> priorizar as pendentes e abri-las para análise.</w:t>
+        <w:t>Permite ao Gerente de Suprimentos localizar as solicitações de compra encaminhadas para revisão, distinguindo as pendentes das já revisadas, e abrir a que deseja analisar para priorizar o trabalho de revisão.</w:t>
       </w:r>
     </w:p>
     <w:p>
@@ -9091,6 +8958,24 @@
         <w:t>Histórico de versões</w:t>
       </w:r>
     </w:p>
+    <w:p>
+      <w:pPr>
+        <w:spacing w:before="0" w:after="100" w:line="276" w:lineRule="auto"/>
+        <w:jc w:val="both"/>
+      </w:pPr>
+      <w:r>
+        <w:t xml:space="preserve">A coluna </w:t>
+      </w:r>
+      <w:r>
+        <w:rPr>
+          <w:b/>
+        </w:rPr>
+        <w:t>Origem</w:t>
+      </w:r>
+      <w:r>
+        <w:t xml:space="preserve"> registra a história de usuário ou a demanda que deu lastro à criação ou à evolução das funcionalidades desta versão — é o único ponto em que a história é citada no documento.</w:t>
+      </w:r>
+    </w:p>
     <w:tbl>
       <w:tblPr>
         <w:tblStyle w:val="TableGrid"/>
@@ -9098,14 +8983,15 @@
         <w:tblLook w:firstColumn="1" w:firstRow="1" w:lastColumn="0" w:lastRow="0" w:noHBand="0" w:noVBand="1" w:val="04A0"/>
       </w:tblPr>
       <w:tblGrid>
-        <w:gridCol w:w="3213"/>
-        <w:gridCol w:w="3213"/>
-        <w:gridCol w:w="3213"/>
+        <w:gridCol w:w="2409"/>
+        <w:gridCol w:w="2409"/>
+        <w:gridCol w:w="2409"/>
+        <w:gridCol w:w="2409"/>
       </w:tblGrid>
       <w:tr>
         <w:tc>
           <w:tcPr>
-            <w:tcW w:type="dxa" w:w="3213"/>
+            <w:tcW w:type="dxa" w:w="2409"/>
             <w:shd w:val="clear" w:fill="E6EBF4"/>
           </w:tcPr>
           <w:p>
@@ -9124,7 +9010,7 @@
         </w:tc>
         <w:tc>
           <w:tcPr>
-            <w:tcW w:type="dxa" w:w="3213"/>
+            <w:tcW w:type="dxa" w:w="2409"/>
             <w:shd w:val="clear" w:fill="E6EBF4"/>
           </w:tcPr>
           <w:p>
@@ -9143,7 +9029,26 @@
         </w:tc>
         <w:tc>
           <w:tcPr>
-            <w:tcW w:type="dxa" w:w="3213"/>
+            <w:tcW w:type="dxa" w:w="2409"/>
+            <w:shd w:val="clear" w:fill="E6EBF4"/>
+          </w:tcPr>
+          <w:p>
+            <w:pPr>
+              <w:spacing w:after="40"/>
+            </w:pPr>
+            <w:r>
+              <w:rPr>
+                <w:rFonts w:ascii="Calibri" w:hAnsi="Calibri"/>
+                <w:b/>
+                <w:sz w:val="18"/>
+              </w:rPr>
+              <w:t>Origem</w:t>
+            </w:r>
+          </w:p>
+        </w:tc>
+        <w:tc>
+          <w:tcPr>
+            <w:tcW w:type="dxa" w:w="2409"/>
             <w:shd w:val="clear" w:fill="E6EBF4"/>
           </w:tcPr>
           <w:p>
@@ -9164,7 +9069,7 @@
       <w:tr>
         <w:tc>
           <w:tcPr>
-            <w:tcW w:type="dxa" w:w="3213"/>
+            <w:tcW w:type="dxa" w:w="2409"/>
           </w:tcPr>
           <w:p>
             <w:pPr>
@@ -9181,7 +9086,7 @@
         </w:tc>
         <w:tc>
           <w:tcPr>
-            <w:tcW w:type="dxa" w:w="3213"/>
+            <w:tcW w:type="dxa" w:w="2409"/>
           </w:tcPr>
           <w:p>
             <w:pPr>
@@ -9198,7 +9103,24 @@
         </w:tc>
         <w:tc>
           <w:tcPr>
-            <w:tcW w:type="dxa" w:w="3213"/>
+            <w:tcW w:type="dxa" w:w="2409"/>
+          </w:tcPr>
+          <w:p>
+            <w:pPr>
+              <w:spacing w:after="40"/>
+            </w:pPr>
+            <w:r>
+              <w:rPr>
+                <w:rFonts w:ascii="Calibri" w:hAnsi="Calibri"/>
+                <w:sz w:val="18"/>
+              </w:rPr>
+              <w:t>Demanda de especificação do Módulo 07 — cards PDTIC25114-468 a 493 (Sprint SP23)</w:t>
+            </w:r>
+          </w:p>
+        </w:tc>
+        <w:tc>
+          <w:tcPr>
+            <w:tcW w:type="dxa" w:w="2409"/>
           </w:tcPr>
           <w:p>
             <w:pPr>

</xml_diff>